<commit_message>
Done print preview docx ranap obsgyn
</commit_message>
<xml_diff>
--- a/public/doc/emr/print_ranap_neonatus_perawat.docx
+++ b/public/doc/emr/print_ranap_neonatus_perawat.docx
@@ -513,7 +513,15 @@
                 <w:color w:val="FFFFFF" w:themeColor="background1"/>
                 <w:sz w:val="26"/>
               </w:rPr>
-              <w:t xml:space="preserve">JALAN </w:t>
+              <w:t>INAP</w:t>
+            </w:r>
+            <w:r>
+              <w:rPr>
+                <w:b/>
+                <w:color w:val="FFFFFF" w:themeColor="background1"/>
+                <w:sz w:val="26"/>
+              </w:rPr>
+              <w:t xml:space="preserve"> </w:t>
             </w:r>
             <w:r>
               <w:rPr>
@@ -1355,16 +1363,7 @@
                 <w:sz w:val="20"/>
                 <w:szCs w:val="20"/>
               </w:rPr>
-              <w:t xml:space="preserve">PENILAIAN </w:t>
-            </w:r>
-            <w:r>
-              <w:rPr>
-                <w:b/>
-                <w:bCs/>
-                <w:sz w:val="20"/>
-                <w:szCs w:val="20"/>
-              </w:rPr>
-              <w:t>APGAR SCORE</w:t>
+              <w:t>PENILAIAN APGAR SCORE</w:t>
             </w:r>
           </w:p>
         </w:tc>
@@ -2777,22 +2776,17 @@
           <w:p>
             <w:pPr>
               <w:rPr>
+                <w:sz w:val="17"/>
+              </w:rPr>
+            </w:pPr>
+            <w:r>
+              <w:rPr>
                 <w:b/>
                 <w:bCs/>
                 <w:sz w:val="20"/>
                 <w:szCs w:val="20"/>
-                <w:lang w:val="en-ID"/>
-              </w:rPr>
-            </w:pPr>
-            <w:r>
-              <w:rPr>
-                <w:b/>
-                <w:bCs/>
-                <w:sz w:val="20"/>
-                <w:szCs w:val="20"/>
-                <w:lang w:val="en-ID"/>
-              </w:rPr>
-              <w:t>PERENCANAAN DAN TINDAKAN</w:t>
+              </w:rPr>
+              <w:t>DISCHARGE PLANNING</w:t>
             </w:r>
           </w:p>
         </w:tc>
@@ -2805,17 +2799,29 @@
           <w:p>
             <w:pPr>
               <w:rPr>
-                <w:b/>
-                <w:bCs/>
                 <w:lang w:val="en-ID"/>
               </w:rPr>
             </w:pPr>
             <w:r>
-              <w:rPr>
-                <w:b/>
-                <w:bCs/>
-              </w:rPr>
-              <w:t>Mandiri</w:t>
+              <w:t>${</w:t>
+            </w:r>
+            <w:r>
+              <w:rPr>
+                <w:lang w:val="en-ID"/>
+              </w:rPr>
+              <w:t>DI</w:t>
+            </w:r>
+            <w:r>
+              <w:rPr>
+                <w:lang w:val="en-ID"/>
+              </w:rPr>
+              <w:t>S</w:t>
+            </w:r>
+            <w:r>
+              <w:rPr>
+                <w:lang w:val="en-ID"/>
+              </w:rPr>
+              <w:t>CHARGE_PLANNING_KOLOM_1}</w:t>
             </w:r>
           </w:p>
         </w:tc>
@@ -2826,272 +2832,29 @@
           <w:p>
             <w:pPr>
               <w:rPr>
-                <w:b/>
-                <w:bCs/>
                 <w:lang w:val="en-ID"/>
               </w:rPr>
             </w:pPr>
             <w:r>
-              <w:rPr>
-                <w:b/>
-                <w:bCs/>
+              <w:t>${</w:t>
+            </w:r>
+            <w:r>
+              <w:rPr>
                 <w:lang w:val="en-ID"/>
               </w:rPr>
-              <w:t>Kolaborasi</w:t>
-            </w:r>
-          </w:p>
-        </w:tc>
-      </w:tr>
-      <w:tr>
-        <w:trPr>
-          <w:trHeight w:val="269"/>
-        </w:trPr>
-        <w:tc>
-          <w:tcPr>
-            <w:tcW w:w="5653" w:type="dxa"/>
-            <w:vMerge w:val="restart"/>
-          </w:tcPr>
-          <w:p>
-            <w:pPr>
-              <w:rPr>
-                <w:sz w:val="17"/>
+              <w:t>DI</w:t>
+            </w:r>
+            <w:r>
+              <w:rPr>
                 <w:lang w:val="en-ID"/>
               </w:rPr>
-            </w:pPr>
-            <w:r>
-              <w:t>${</w:t>
+              <w:t>S</w:t>
             </w:r>
             <w:r>
               <w:rPr>
                 <w:lang w:val="en-ID"/>
               </w:rPr>
-              <w:t>TINDAKAN}</w:t>
-            </w:r>
-          </w:p>
-        </w:tc>
-        <w:tc>
-          <w:tcPr>
-            <w:tcW w:w="5654" w:type="dxa"/>
-          </w:tcPr>
-          <w:p>
-            <w:pPr>
-              <w:rPr>
-                <w:sz w:val="17"/>
-                <w:lang w:val="en-ID"/>
-              </w:rPr>
-            </w:pPr>
-            <w:r>
-              <w:t>${</w:t>
-            </w:r>
-            <w:r>
-              <w:rPr>
-                <w:lang w:val="en-ID"/>
-              </w:rPr>
-              <w:t>RAWAT_LUKA}</w:t>
-            </w:r>
-          </w:p>
-        </w:tc>
-      </w:tr>
-      <w:tr>
-        <w:trPr>
-          <w:trHeight w:val="269"/>
-        </w:trPr>
-        <w:tc>
-          <w:tcPr>
-            <w:tcW w:w="5653" w:type="dxa"/>
-            <w:vMerge/>
-          </w:tcPr>
-          <w:p>
-            <w:pPr>
-              <w:ind w:left="426"/>
-              <w:rPr>
-                <w:noProof/>
-              </w:rPr>
-            </w:pPr>
-          </w:p>
-        </w:tc>
-        <w:tc>
-          <w:tcPr>
-            <w:tcW w:w="5654" w:type="dxa"/>
-          </w:tcPr>
-          <w:p>
-            <w:pPr>
-              <w:rPr>
-                <w:b/>
-                <w:bCs/>
-                <w:noProof/>
-                <w:sz w:val="17"/>
-                <w:lang w:val="en-ID"/>
-              </w:rPr>
-            </w:pPr>
-            <w:r>
-              <w:rPr>
-                <w:b/>
-                <w:bCs/>
-                <w:noProof/>
-                <w:sz w:val="17"/>
-                <w:lang w:val="en-ID"/>
-              </w:rPr>
-              <w:t>Pemberian Terapi</w:t>
-            </w:r>
-          </w:p>
-        </w:tc>
-      </w:tr>
-      <w:tr>
-        <w:trPr>
-          <w:trHeight w:val="269"/>
-        </w:trPr>
-        <w:tc>
-          <w:tcPr>
-            <w:tcW w:w="5653" w:type="dxa"/>
-            <w:vMerge/>
-          </w:tcPr>
-          <w:p>
-            <w:pPr>
-              <w:ind w:left="426"/>
-              <w:rPr>
-                <w:noProof/>
-              </w:rPr>
-            </w:pPr>
-          </w:p>
-        </w:tc>
-        <w:tc>
-          <w:tcPr>
-            <w:tcW w:w="5654" w:type="dxa"/>
-            <w:vAlign w:val="center"/>
-          </w:tcPr>
-          <w:p>
-            <w:pPr>
-              <w:rPr>
-                <w:noProof/>
-                <w:sz w:val="17"/>
-                <w:lang w:val="en-ID"/>
-              </w:rPr>
-            </w:pPr>
-            <w:r>
-              <w:t>${</w:t>
-            </w:r>
-            <w:r>
-              <w:rPr>
-                <w:lang w:val="en-ID"/>
-              </w:rPr>
-              <w:t>TERAPI}</w:t>
-            </w:r>
-          </w:p>
-        </w:tc>
-      </w:tr>
-    </w:tbl>
-    <w:p/>
-    <w:tbl>
-      <w:tblPr>
-        <w:tblStyle w:val="TableGrid"/>
-        <w:tblW w:w="0" w:type="auto"/>
-        <w:tblLook w:val="04A0" w:firstRow="1" w:lastRow="0" w:firstColumn="1" w:lastColumn="0" w:noHBand="0" w:noVBand="1"/>
-      </w:tblPr>
-      <w:tblGrid>
-        <w:gridCol w:w="5653"/>
-        <w:gridCol w:w="5654"/>
-      </w:tblGrid>
-      <w:tr>
-        <w:tc>
-          <w:tcPr>
-            <w:tcW w:w="11307" w:type="dxa"/>
-            <w:gridSpan w:val="2"/>
-          </w:tcPr>
-          <w:p>
-            <w:pPr>
-              <w:rPr>
-                <w:sz w:val="17"/>
-              </w:rPr>
-            </w:pPr>
-            <w:r>
-              <w:rPr>
-                <w:b/>
-                <w:bCs/>
-                <w:sz w:val="20"/>
-                <w:szCs w:val="20"/>
-              </w:rPr>
-              <w:t>RENCANA ASUHAN KEPERAWATAN</w:t>
-            </w:r>
-          </w:p>
-        </w:tc>
-      </w:tr>
-      <w:tr>
-        <w:tc>
-          <w:tcPr>
-            <w:tcW w:w="5653" w:type="dxa"/>
-          </w:tcPr>
-          <w:p>
-            <w:pPr>
-              <w:rPr>
-                <w:lang w:val="en-ID"/>
-              </w:rPr>
-            </w:pPr>
-            <w:r>
-              <w:t>${</w:t>
-            </w:r>
-            <w:r>
-              <w:rPr>
-                <w:lang w:val="en-ID"/>
-              </w:rPr>
-              <w:t>DI</w:t>
-            </w:r>
-            <w:r>
-              <w:rPr>
-                <w:lang w:val="en-ID"/>
-              </w:rPr>
-              <w:t>S</w:t>
-            </w:r>
-            <w:r>
-              <w:rPr>
-                <w:lang w:val="en-ID"/>
-              </w:rPr>
-              <w:t>CHARGE_PLANNING_KOLOM_1}</w:t>
-            </w:r>
-          </w:p>
-        </w:tc>
-        <w:tc>
-          <w:tcPr>
-            <w:tcW w:w="5654" w:type="dxa"/>
-          </w:tcPr>
-          <w:p>
-            <w:pPr>
-              <w:rPr>
-                <w:lang w:val="en-ID"/>
-              </w:rPr>
-            </w:pPr>
-            <w:r>
-              <w:t>${</w:t>
-            </w:r>
-            <w:r>
-              <w:rPr>
-                <w:lang w:val="en-ID"/>
-              </w:rPr>
-              <w:t>DI</w:t>
-            </w:r>
-            <w:r>
-              <w:rPr>
-                <w:lang w:val="en-ID"/>
-              </w:rPr>
-              <w:t>S</w:t>
-            </w:r>
-            <w:r>
-              <w:rPr>
-                <w:lang w:val="en-ID"/>
-              </w:rPr>
-              <w:t>CHARGE_PLANNING_KOLOM_</w:t>
-            </w:r>
-            <w:r>
-              <w:rPr>
-                <w:lang w:val="en-ID"/>
-              </w:rPr>
-              <w:t>2</w:t>
-            </w:r>
-            <w:r>
-              <w:rPr>
-                <w:lang w:val="en-ID"/>
-              </w:rPr>
-              <w:t>}</w:t>
+              <w:t>CHARGE_PLANNING_KOLOM_2}</w:t>
             </w:r>
           </w:p>
         </w:tc>
@@ -4596,6 +4359,7 @@
   <w:style w:type="character" w:default="1" w:styleId="DefaultParagraphFont">
     <w:name w:val="Default Paragraph Font"/>
     <w:uiPriority w:val="1"/>
+    <w:semiHidden/>
     <w:unhideWhenUsed/>
   </w:style>
   <w:style w:type="table" w:default="1" w:styleId="TableNormal">

</xml_diff>